<commit_message>
Require PR metadata for grading export
</commit_message>
<xml_diff>
--- a/PRD.docx
+++ b/PRD.docx
@@ -2743,6 +2743,54 @@
               <w:rPr>
                 <w:sz w:val="18"/>
               </w:rPr>
+              <w:t>仓库信息</w:t>
+            </w:r>
+          </w:p>
+        </w:tc>
+        <w:tc>
+          <w:tcPr>
+            <w:tcW w:type="dxa" w:w="7992"/>
+            <w:tcMar>
+              <w:top w:w="80" w:type="dxa"/>
+              <w:start w:w="120" w:type="dxa"/>
+              <w:bottom w:w="80" w:type="dxa"/>
+              <w:end w:w="120" w:type="dxa"/>
+            </w:tcMar>
+            <w:vAlign w:val="center"/>
+          </w:tcPr>
+          <w:p>
+            <w:pPr>
+              <w:spacing w:after="0"/>
+            </w:pPr>
+            <w:r>
+              <w:rPr>
+                <w:sz w:val="18"/>
+              </w:rPr>
+              <w:t>创建 Pull Request 时必须填写学生 Fork 仓库地址和提交分支。PR 编号由 GitHub 自动生成，学生可创建后补填。</w:t>
+            </w:r>
+          </w:p>
+        </w:tc>
+      </w:tr>
+      <w:tr>
+        <w:tc>
+          <w:tcPr>
+            <w:tcW w:type="dxa" w:w="2088"/>
+            <w:tcMar>
+              <w:top w:w="80" w:type="dxa"/>
+              <w:start w:w="120" w:type="dxa"/>
+              <w:bottom w:w="80" w:type="dxa"/>
+              <w:end w:w="120" w:type="dxa"/>
+            </w:tcMar>
+            <w:vAlign w:val="center"/>
+          </w:tcPr>
+          <w:p>
+            <w:pPr>
+              <w:spacing w:after="0"/>
+            </w:pPr>
+            <w:r>
+              <w:rPr>
+                <w:sz w:val="18"/>
+              </w:rPr>
               <w:t>提交清单</w:t>
             </w:r>
           </w:p>
@@ -2815,6 +2863,54 @@
                 <w:sz w:val="18"/>
               </w:rPr>
               <w:t>Pull Request 创建或更新后，教师仓库的 GitHub Actions 会自动运行 public_tests，并在 Actions Summary 或 PR 评论中显示公开测试结果。</w:t>
+            </w:r>
+          </w:p>
+        </w:tc>
+      </w:tr>
+      <w:tr>
+        <w:tc>
+          <w:tcPr>
+            <w:tcW w:type="dxa" w:w="2088"/>
+            <w:tcMar>
+              <w:top w:w="80" w:type="dxa"/>
+              <w:start w:w="120" w:type="dxa"/>
+              <w:bottom w:w="80" w:type="dxa"/>
+              <w:end w:w="120" w:type="dxa"/>
+            </w:tcMar>
+            <w:vAlign w:val="center"/>
+          </w:tcPr>
+          <w:p>
+            <w:pPr>
+              <w:spacing w:after="0"/>
+            </w:pPr>
+            <w:r>
+              <w:rPr>
+                <w:sz w:val="18"/>
+              </w:rPr>
+              <w:t>自动记录</w:t>
+            </w:r>
+          </w:p>
+        </w:tc>
+        <w:tc>
+          <w:tcPr>
+            <w:tcW w:type="dxa" w:w="7992"/>
+            <w:tcMar>
+              <w:top w:w="80" w:type="dxa"/>
+              <w:start w:w="120" w:type="dxa"/>
+              <w:bottom w:w="80" w:type="dxa"/>
+              <w:end w:w="120" w:type="dxa"/>
+            </w:tcMar>
+            <w:vAlign w:val="center"/>
+          </w:tcPr>
+          <w:p>
+            <w:pPr>
+              <w:spacing w:after="0"/>
+            </w:pPr>
+            <w:r>
+              <w:rPr>
+                <w:sz w:val="18"/>
+              </w:rPr>
+              <w:t>教师可通过 GitHub Pull Request 元数据自动导出 students.csv，记录学号、姓名、GitHub 用户名、学生 Fork 仓库地址、提交分支和 PR 编号。</w:t>
             </w:r>
           </w:p>
         </w:tc>
@@ -2935,7 +3031,7 @@
         <w:pStyle w:val="ListNumber"/>
       </w:pPr>
       <w:r>
-        <w:t>在 PR 模板中填写学号、姓名、GitHub 用户名和提交清单。</w:t>
+        <w:t>在 PR 模板中填写学号、姓名、GitHub 用户名、Fork 仓库地址、提交分支和提交清单。</w:t>
       </w:r>
     </w:p>
     <w:p>

</xml_diff>